<commit_message>
docs: embed mobile mockup screenshot into Word deliverable
</commit_message>
<xml_diff>
--- a/Documento_Entrega_FitMotion_ULagos.docx
+++ b/Documento_Entrega_FitMotion_ULagos.docx
@@ -278,7 +278,7 @@
               <w:rPr>
                 <w:sz w:val="19"/>
               </w:rPr>
-              <w:t>Punto de entrada seguro con validación de credenciales (usuario/1234), alerta háptica de rechazo ante fallos, persistencia de sesión con TinyDB y estética Slate-900 con logotipo oficial.</w:t>
+              <w:t>Punto de entrada seguro con validación de credenciales (usuario/1234), alerta háptica de rechazo ante fallos, persistencia de sesión con TinyDB y diseño Dark Mode con logotipo oficial.</w:t>
             </w:r>
           </w:p>
         </w:tc>
@@ -480,6 +480,60 @@
       <w:pPr>
         <w:spacing w:after="160"/>
       </w:pPr>
+    </w:p>
+    <w:p>
+      <w:pPr>
+        <w:spacing w:before="120" w:after="80"/>
+        <w:jc w:val="center"/>
+      </w:pPr>
+      <w:r>
+        <w:drawing>
+          <wp:inline xmlns:a="http://schemas.openxmlformats.org/drawingml/2006/main" xmlns:pic="http://schemas.openxmlformats.org/drawingml/2006/picture">
+            <wp:extent cx="2011680" cy="3909060"/>
+            <wp:docPr id="1" name="Picture 1"/>
+            <wp:cNvGraphicFramePr>
+              <a:graphicFrameLocks noChangeAspect="1"/>
+            </wp:cNvGraphicFramePr>
+            <a:graphic>
+              <a:graphicData uri="http://schemas.openxmlformats.org/drawingml/2006/picture">
+                <pic:pic>
+                  <pic:nvPicPr>
+                    <pic:cNvPr id="0" name="Captura de pantalla 2026-10-01 162438.png"/>
+                    <pic:cNvPicPr/>
+                  </pic:nvPicPr>
+                  <pic:blipFill>
+                    <a:blip r:embed="rId9"/>
+                    <a:stretch>
+                      <a:fillRect/>
+                    </a:stretch>
+                  </pic:blipFill>
+                  <pic:spPr>
+                    <a:xfrm>
+                      <a:off x="0" y="0"/>
+                      <a:ext cx="2011680" cy="3909060"/>
+                    </a:xfrm>
+                    <a:prstGeom prst="rect"/>
+                  </pic:spPr>
+                </pic:pic>
+              </a:graphicData>
+            </a:graphic>
+          </wp:inline>
+        </w:drawing>
+      </w:r>
+    </w:p>
+    <w:p>
+      <w:pPr>
+        <w:spacing w:after="200"/>
+        <w:jc w:val="center"/>
+      </w:pPr>
+      <w:r>
+        <w:rPr>
+          <w:i/>
+          <w:color w:val="475569"/>
+          <w:sz w:val="18"/>
+        </w:rPr>
+        <w:t>Figura 1: Interfaz de usuario de FitMotion ejecutada en dispositivo móvil</w:t>
+      </w:r>
     </w:p>
     <w:p>
       <w:pPr>

</xml_diff>

<commit_message>
feat: simplify language, add customizable goals with alarm, and implement pocket mode
</commit_message>
<xml_diff>
--- a/Documento_Entrega_FitMotion_ULagos.docx
+++ b/Documento_Entrega_FitMotion_ULagos.docx
@@ -2,23 +2,6 @@
 <file path=word/document.xml><?xml version="1.0" encoding="utf-8"?>
 <w:document xmlns:wpc="http://schemas.microsoft.com/office/word/2010/wordprocessingCanvas" xmlns:mo="http://schemas.microsoft.com/office/mac/office/2008/main" xmlns:mc="http://schemas.openxmlformats.org/markup-compatibility/2006" xmlns:mv="urn:schemas-microsoft-com:mac:vml" xmlns:o="urn:schemas-microsoft-com:office:office" xmlns:r="http://schemas.openxmlformats.org/officeDocument/2006/relationships" xmlns:m="http://schemas.openxmlformats.org/officeDocument/2006/math" xmlns:v="urn:schemas-microsoft-com:vml" xmlns:wp14="http://schemas.microsoft.com/office/word/2010/wordprocessingDrawing" xmlns:wp="http://schemas.openxmlformats.org/drawingml/2006/wordprocessingDrawing" xmlns:w10="urn:schemas-microsoft-com:office:word" xmlns:w="http://schemas.openxmlformats.org/wordprocessingml/2006/main" xmlns:w14="http://schemas.microsoft.com/office/word/2010/wordml" xmlns:wpg="http://schemas.microsoft.com/office/word/2010/wordprocessingGroup" xmlns:wpi="http://schemas.microsoft.com/office/word/2010/wordprocessingInk" xmlns:wne="http://schemas.microsoft.com/office/word/2006/wordml" xmlns:wps="http://schemas.microsoft.com/office/word/2010/wordprocessingShape" mc:Ignorable="w14 wp14">
   <w:body>
-    <w:p>
-      <w:pPr>
-        <w:spacing w:after="120"/>
-        <w:jc w:val="center"/>
-      </w:pPr>
-      <w:r>
-        <w:rPr>
-          <w:rFonts w:ascii="Calibri" w:hAnsi="Calibri"/>
-          <w:b/>
-          <w:color w:val="475569"/>
-          <w:sz w:val="20"/>
-        </w:rPr>
-        <w:t>UNIVERSIDAD DE LOS LAGOS • DEPARTAMENTO DE INGENIERÍA EN INFORMÁTICA</w:t>
-        <w:br/>
-        <w:t>DESARROLLO DE APLICACIÓN MÓVIL</w:t>
-      </w:r>
-    </w:p>
     <w:p>
       <w:pPr>
         <w:spacing w:after="40"/>
@@ -28,134 +11,305 @@
         <w:rPr>
           <w:rFonts w:ascii="Calibri" w:hAnsi="Calibri"/>
           <w:b/>
-          <w:color w:val="0F172A"/>
-          <w:sz w:val="48"/>
+          <w:i w:val="0"/>
+          <w:color w:val="64748B"/>
+          <w:sz w:val="20"/>
         </w:rPr>
-        <w:t>FitMotion — Smart Sensor Workout</w:t>
+        <w:t>UNIVERSIDAD DE LOS LAGOS — DEPARTAMENTO DE INGENIERÍA EN INFORMÁTICA</w:t>
+        <w:br/>
+        <w:t>DESARROLLO DE APLICACIÓN MÓVIL</w:t>
       </w:r>
     </w:p>
     <w:p>
       <w:pPr>
-        <w:spacing w:after="320"/>
+        <w:spacing w:before="240" w:after="80"/>
         <w:jc w:val="center"/>
       </w:pPr>
       <w:r>
         <w:rPr>
           <w:rFonts w:ascii="Calibri" w:hAnsi="Calibri"/>
+          <w:b/>
+          <w:i w:val="0"/>
+          <w:color w:val="0F172A"/>
+          <w:sz w:val="40"/>
+        </w:rPr>
+        <w:t>FitMotion — Entrenador de Bolsillo con Sensores</w:t>
+      </w:r>
+    </w:p>
+    <w:p>
+      <w:pPr>
+        <w:spacing w:after="360"/>
+        <w:jc w:val="center"/>
+      </w:pPr>
+      <w:r>
+        <w:rPr>
+          <w:rFonts w:ascii="Calibri" w:hAnsi="Calibri"/>
+          <w:b w:val="0"/>
           <w:i/>
-          <w:color w:val="475569"/>
-          <w:sz w:val="23"/>
+          <w:color w:val="00A8CC"/>
+          <w:sz w:val="22"/>
         </w:rPr>
-        <w:t>Informe Técnico de Proyecto • MIT App Inventor</w:t>
+        <w:t>Informe de Entrega del Proyecto — MIT App Inventor</w:t>
         <w:br/>
         <w:t>Estudiante: Germán Ignacio Guillermo Aravena</w:t>
       </w:r>
     </w:p>
     <w:p>
       <w:pPr>
+        <w:spacing w:after="280"/>
+        <w:pBdr>
+          <w:bottom w:val="single" w:sz="12" w:space="1" w:color="00A8CC"/>
+        </w:pBdr>
+      </w:pPr>
+    </w:p>
+    <w:p>
+      <w:pPr>
         <w:keepNext/>
-        <w:spacing w:before="200" w:after="80"/>
+        <w:spacing w:before="320" w:after="120"/>
       </w:pPr>
       <w:r>
         <w:rPr>
           <w:rFonts w:ascii="Calibri" w:hAnsi="Calibri"/>
           <w:b/>
+          <w:i w:val="0"/>
           <w:color w:val="0F172A"/>
-          <w:sz w:val="30"/>
+          <w:sz w:val="28"/>
         </w:rPr>
         <w:t>1. Introducción</w:t>
       </w:r>
     </w:p>
     <w:p>
       <w:pPr>
-        <w:spacing w:after="160"/>
+        <w:spacing w:before="0" w:after="120" w:line="276" w:lineRule="auto"/>
       </w:pPr>
       <w:r>
-        <w:t>FitMotion es una aplicación móvil desarrollada en MIT App Inventor orientada al acondicionamiento físico y la salud postural. Su propósito fundamental es transformar un teléfono inteligente convencional en un asistente biomecánico capaz de registrar, auditar y retroalimentar entrenamientos físicos en tiempo real sin requerir accesorios externos ni intervención manual constante.</w:t>
-        <w:br/>
-        <w:br/>
-        <w:t>A través del aprovechamiento directo de los sensores de hardware integrados en el dispositivo móvil, la aplicación cuantifica el movimiento del usuario, analiza la técnica de ejecución en ejercicios funcionales y entrega respuestas inmediatas visuales, auditivas y hápticas.</w:t>
+        <w:rPr>
+          <w:rFonts w:ascii="Calibri" w:hAnsi="Calibri"/>
+          <w:b w:val="0"/>
+          <w:i w:val="0"/>
+          <w:color w:val="1E293B"/>
+          <w:sz w:val="22"/>
+        </w:rPr>
+        <w:t>FitMotion es una aplicación móvil desarrollada en MIT App Inventor que ayuda a las personas a entrenar y realizar actividad física en casa o al aire libre usando su propio teléfono celular, sin depender de relojes inteligentes costosos ni pulseras externas. La aplicación aprovecha los sensores nativos del dispositivo (inclinación y movimiento) para contar automáticamente las repeticiones de ejercicios (como sentadillas) o los pasos al caminar o trotar, avisando con una alarma sonora, vibración y voz cuando la persona cumple la meta fijada.</w:t>
       </w:r>
     </w:p>
     <w:p>
       <w:pPr>
         <w:keepNext/>
-        <w:spacing w:before="240" w:after="80"/>
+        <w:spacing w:before="320" w:after="120"/>
       </w:pPr>
       <w:r>
         <w:rPr>
           <w:rFonts w:ascii="Calibri" w:hAnsi="Calibri"/>
           <w:b/>
+          <w:i w:val="0"/>
           <w:color w:val="0F172A"/>
-          <w:sz w:val="30"/>
+          <w:sz w:val="28"/>
         </w:rPr>
         <w:t>2. Problemática y Usuario Objetivo</w:t>
       </w:r>
     </w:p>
     <w:p>
       <w:pPr>
-        <w:spacing w:after="160"/>
+        <w:spacing w:before="0" w:after="120" w:line="276" w:lineRule="auto"/>
       </w:pPr>
       <w:r>
-        <w:t>En la actualidad, una proporción significativa de personas practica actividad física de manera autodidacta en sus hogares o en espacios públicos sin contar con la supervisión de un preparador físico. Esta situación suele generar dos dificultades recurrentes: la imprecisión en el registro manual de las series y repeticiones, y la ejecución deficiente de los ejercicios por falta de retroalimentación inmediata, lo cual incrementa el riesgo de sobrecargas articulares y lesiones lumbares.</w:t>
-        <w:br/>
-        <w:br/>
-        <w:t>FitMotion aborda esta necesidad ofreciendo una herramienta accesible que valida la calidad de cada movimiento mediante parámetros cinemáticos medidos por el propio teléfono.</w:t>
-        <w:br/>
-        <w:br/>
-        <w:t>El usuario objetivo comprende a jóvenes y adultos (entre 18 y 60 años) —incluyendo estudiantes y personas con rutinas laborales sedentarias— que desean incorporar pausas activas o entrenamientos estructurados en su vida diaria, requiriendo un sistema de monitoreo autónomo, confiable y que opere con manos libres.</w:t>
+        <w:rPr>
+          <w:rFonts w:ascii="Calibri" w:hAnsi="Calibri"/>
+          <w:b w:val="0"/>
+          <w:i w:val="0"/>
+          <w:color w:val="1E293B"/>
+          <w:sz w:val="22"/>
+        </w:rPr>
+        <w:t>Hoy en día muchas personas hacen ejercicio en sus hogares de forma autodidacta. Al entrenar solas, suelen ocurrir dos problemas comunes: se pierde la cuenta exacta de las repeticiones y no se sabe si las sentadillas se están haciendo con la profundidad adecuada. Además, tener que mirar la pantalla o manipular el teléfono con las manos sudadas resulta incómodo y corta el ritmo.</w:t>
+      </w:r>
+    </w:p>
+    <w:p>
+      <w:pPr>
+        <w:spacing w:before="0" w:after="120" w:line="276" w:lineRule="auto"/>
+      </w:pPr>
+      <w:r>
+        <w:rPr>
+          <w:rFonts w:ascii="Calibri" w:hAnsi="Calibri"/>
+          <w:b w:val="0"/>
+          <w:i w:val="0"/>
+          <w:color w:val="1E293B"/>
+          <w:sz w:val="22"/>
+        </w:rPr>
+        <w:t>El usuario objetivo abarca a estudiantes, trabajadores y adultos (entre 18 y 60 años) que buscan realizar pausas activas o caminar a diario, necesitando una herramienta simple, fácil de usar y que funcione guardada en el bolsillo.</w:t>
       </w:r>
     </w:p>
     <w:p>
       <w:pPr>
         <w:keepNext/>
-        <w:spacing w:before="240" w:after="80"/>
+        <w:spacing w:before="320" w:after="120"/>
       </w:pPr>
       <w:r>
         <w:rPr>
           <w:rFonts w:ascii="Calibri" w:hAnsi="Calibri"/>
           <w:b/>
+          <w:i w:val="0"/>
           <w:color w:val="0F172A"/>
-          <w:sz w:val="30"/>
+          <w:sz w:val="28"/>
         </w:rPr>
-        <w:t>3. Propuesta de Solución</w:t>
+        <w:t>3. Propuesta de Solución y Novedades</w:t>
       </w:r>
     </w:p>
     <w:p>
       <w:pPr>
-        <w:spacing w:after="160"/>
+        <w:spacing w:before="0" w:after="120" w:line="276" w:lineRule="auto"/>
       </w:pPr>
       <w:r>
-        <w:t>La solución plantea un flujo de entrenamiento guiado donde el teléfono móvil actúa como sensor inercial adherido al cuerpo (ubicado en el muslo, bolsillo o sostenido en la mano).</w:t>
-        <w:br/>
-        <w:br/>
-        <w:t>A diferencia de las aplicaciones tradicionales que se limitan a cronómetros estáticos o bitácoras manuales, FitMotion implementa algoritmos de detección cinemática que analizan en tiempo real los datos angulares y aceleraciones del usuario. De este modo, una repetición sólo se da por válida cuando se completa el rango articular biomecánico requerido, promoviendo una técnica correcta y manteniendo al usuario motivado mediante estímulos auditivos y táctiles continuos.</w:t>
+        <w:rPr>
+          <w:rFonts w:ascii="Calibri" w:hAnsi="Calibri"/>
+          <w:b w:val="0"/>
+          <w:i w:val="0"/>
+          <w:color w:val="1E293B"/>
+          <w:sz w:val="22"/>
+        </w:rPr>
+        <w:t>FitMotion convierte el teléfono móvil en un asistente de bolsillo para entrenar sin distracciones:</w:t>
+      </w:r>
+    </w:p>
+    <w:p>
+      <w:pPr>
+        <w:pStyle w:val="ListBullet"/>
+        <w:spacing w:before="0" w:after="80" w:line="276" w:lineRule="auto"/>
+      </w:pPr>
+      <w:r>
+        <w:rPr>
+          <w:rFonts w:ascii="Calibri" w:hAnsi="Calibri"/>
+          <w:b/>
+          <w:i w:val="0"/>
+          <w:color w:val="0F172A"/>
+          <w:sz w:val="22"/>
+        </w:rPr>
+        <w:t xml:space="preserve">Objetivos Personalizables: </w:t>
+      </w:r>
+      <w:r>
+        <w:rPr>
+          <w:rFonts w:ascii="Calibri" w:hAnsi="Calibri"/>
+          <w:b w:val="0"/>
+          <w:i w:val="0"/>
+          <w:color w:val="1E293B"/>
+          <w:sz w:val="22"/>
+        </w:rPr>
+        <w:t>El usuario puede escribir cuántas sentadillas (ej. 15 repeticiones) o cuántos pasos (ej. 1.000 pasos) quiere realizar antes de comenzar.</w:t>
+      </w:r>
+    </w:p>
+    <w:p>
+      <w:pPr>
+        <w:pStyle w:val="ListBullet"/>
+        <w:spacing w:before="0" w:after="80" w:line="276" w:lineRule="auto"/>
+      </w:pPr>
+      <w:r>
+        <w:rPr>
+          <w:rFonts w:ascii="Calibri" w:hAnsi="Calibri"/>
+          <w:b/>
+          <w:i w:val="0"/>
+          <w:color w:val="0F172A"/>
+          <w:sz w:val="22"/>
+        </w:rPr>
+        <w:t xml:space="preserve">Alarma Sonora al Cumplir la Meta: </w:t>
+      </w:r>
+      <w:r>
+        <w:rPr>
+          <w:rFonts w:ascii="Calibri" w:hAnsi="Calibri"/>
+          <w:b w:val="0"/>
+          <w:i w:val="0"/>
+          <w:color w:val="1E293B"/>
+          <w:sz w:val="22"/>
+        </w:rPr>
+        <w:t>Al alcanzar el objetivo fijado, suena una alarma en el teléfono, vibra de forma prolongada y una voz felicita al usuario, anunciando que la meta se cumplió exitosamente.</w:t>
+      </w:r>
+    </w:p>
+    <w:p>
+      <w:pPr>
+        <w:pStyle w:val="ListBullet"/>
+        <w:spacing w:before="0" w:after="80" w:line="276" w:lineRule="auto"/>
+      </w:pPr>
+      <w:r>
+        <w:rPr>
+          <w:rFonts w:ascii="Calibri" w:hAnsi="Calibri"/>
+          <w:b/>
+          <w:i w:val="0"/>
+          <w:color w:val="0F172A"/>
+          <w:sz w:val="22"/>
+        </w:rPr>
+        <w:t xml:space="preserve">Modo Bolsillo (Pantalla Bloqueada): </w:t>
+      </w:r>
+      <w:r>
+        <w:rPr>
+          <w:rFonts w:ascii="Calibri" w:hAnsi="Calibri"/>
+          <w:b w:val="0"/>
+          <w:i w:val="0"/>
+          <w:color w:val="1E293B"/>
+          <w:sz w:val="22"/>
+        </w:rPr>
+        <w:t>Permite bloquear los toques táctiles y oscurecer la pantalla mientras el celular está dentro del bolsillo, manteniendo activos los sensores y relojes para contar el ejercicio sin toques accidentales.</w:t>
+      </w:r>
+    </w:p>
+    <w:p>
+      <w:pPr>
+        <w:pStyle w:val="ListBullet"/>
+        <w:spacing w:before="0" w:after="80" w:line="276" w:lineRule="auto"/>
+      </w:pPr>
+      <w:r>
+        <w:rPr>
+          <w:rFonts w:ascii="Calibri" w:hAnsi="Calibri"/>
+          <w:b/>
+          <w:i w:val="0"/>
+          <w:color w:val="0F172A"/>
+          <w:sz w:val="22"/>
+        </w:rPr>
+        <w:t xml:space="preserve">Lenguaje Claro y Directo: </w:t>
+      </w:r>
+      <w:r>
+        <w:rPr>
+          <w:rFonts w:ascii="Calibri" w:hAnsi="Calibri"/>
+          <w:b w:val="0"/>
+          <w:i w:val="0"/>
+          <w:color w:val="1E293B"/>
+          <w:sz w:val="22"/>
+        </w:rPr>
+        <w:t>Se simplificó la interfaz para hablarle al usuario final de forma natural, sin palabras raras ni tecnicismos innecesarios.</w:t>
       </w:r>
     </w:p>
     <w:p>
       <w:pPr>
         <w:keepNext/>
-        <w:spacing w:before="240" w:after="80"/>
+        <w:spacing w:before="320" w:after="120"/>
       </w:pPr>
       <w:r>
         <w:rPr>
           <w:rFonts w:ascii="Calibri" w:hAnsi="Calibri"/>
           <w:b/>
+          <w:i w:val="0"/>
           <w:color w:val="0F172A"/>
-          <w:sz w:val="30"/>
+          <w:sz w:val="28"/>
         </w:rPr>
         <w:t>4. Arquitectura de Pantallas y Navegación</w:t>
       </w:r>
     </w:p>
     <w:p>
+      <w:pPr>
+        <w:spacing w:before="0" w:after="120" w:line="276" w:lineRule="auto"/>
+      </w:pPr>
       <w:r>
-        <w:t>La aplicación está estructurada en 4 pantallas secuenciales e interconectadas que cubren desde el acceso inicial hasta la entrega final de resultados:</w:t>
+        <w:rPr>
+          <w:rFonts w:ascii="Calibri" w:hAnsi="Calibri"/>
+          <w:b w:val="0"/>
+          <w:i w:val="0"/>
+          <w:color w:val="1E293B"/>
+          <w:sz w:val="22"/>
+        </w:rPr>
+        <w:t>La app cuenta con 4 pantallas ordenadas y conectadas de forma fluida:</w:t>
       </w:r>
     </w:p>
     <w:tbl>
       <w:tblPr>
         <w:tblW w:type="auto" w:w="0"/>
         <w:jc w:val="center"/>
+        <w:tblLayout w:type="fixed"/>
         <w:tblLook w:firstColumn="1" w:firstRow="1" w:lastColumn="0" w:lastRow="0" w:noHBand="0" w:noVBand="1" w:val="04A0"/>
       </w:tblPr>
       <w:tblGrid>
@@ -171,12 +325,15 @@
           </w:tcPr>
           <w:p>
             <w:pPr>
-              <w:jc w:val="center"/>
+              <w:spacing w:before="80" w:after="80"/>
             </w:pPr>
             <w:r>
               <w:rPr>
+                <w:rFonts w:ascii="Calibri" w:hAnsi="Calibri"/>
                 <w:b/>
+                <w:i w:val="0"/>
                 <w:color w:val="FFFFFF"/>
+                <w:sz w:val="20"/>
               </w:rPr>
               <w:t>Pantalla</w:t>
             </w:r>
@@ -184,37 +341,43 @@
         </w:tc>
         <w:tc>
           <w:tcPr>
-            <w:tcW w:type="dxa" w:w="2016"/>
+            <w:tcW w:type="dxa" w:w="2592"/>
             <w:shd w:fill="0F172A"/>
           </w:tcPr>
           <w:p>
             <w:pPr>
-              <w:jc w:val="center"/>
+              <w:spacing w:before="80" w:after="80"/>
             </w:pPr>
             <w:r>
               <w:rPr>
+                <w:rFonts w:ascii="Calibri" w:hAnsi="Calibri"/>
                 <w:b/>
+                <w:i w:val="0"/>
                 <w:color w:val="FFFFFF"/>
+                <w:sz w:val="20"/>
               </w:rPr>
-              <w:t>Identificador</w:t>
+              <w:t>Nombre en App Inventor</w:t>
             </w:r>
           </w:p>
         </w:tc>
         <w:tc>
           <w:tcPr>
-            <w:tcW w:type="dxa" w:w="5616"/>
+            <w:tcW w:type="dxa" w:w="5040"/>
             <w:shd w:fill="0F172A"/>
           </w:tcPr>
           <w:p>
             <w:pPr>
-              <w:jc w:val="center"/>
+              <w:spacing w:before="80" w:after="80"/>
             </w:pPr>
             <w:r>
               <w:rPr>
+                <w:rFonts w:ascii="Calibri" w:hAnsi="Calibri"/>
                 <w:b/>
+                <w:i w:val="0"/>
                 <w:color w:val="FFFFFF"/>
+                <w:sz w:val="20"/>
               </w:rPr>
-              <w:t>Descripción y Flujo Operativo</w:t>
+              <w:t>Descripción y Flujo</w:t>
             </w:r>
           </w:p>
         </w:tc>
@@ -224,17 +387,17 @@
           <w:tcPr>
             <w:tcW w:type="dxa" w:w="1728"/>
             <w:shd w:fill="F8FAFC"/>
-            <w:tcMar>
-              <w:top w:w="80" w:type="dxa"/>
-              <w:bottom w:w="80" w:type="dxa"/>
-              <w:left w:w="100" w:type="dxa"/>
-              <w:right w:w="100" w:type="dxa"/>
-            </w:tcMar>
           </w:tcPr>
           <w:p>
+            <w:pPr>
+              <w:spacing w:before="80" w:after="80"/>
+            </w:pPr>
             <w:r>
               <w:rPr>
-                <w:b/>
+                <w:rFonts w:ascii="Calibri" w:hAnsi="Calibri"/>
+                <w:b w:val="0"/>
+                <w:i w:val="0"/>
+                <w:color w:val="1E293B"/>
                 <w:sz w:val="19"/>
               </w:rPr>
               <w:t>Pantalla 1</w:t>
@@ -243,19 +406,19 @@
         </w:tc>
         <w:tc>
           <w:tcPr>
-            <w:tcW w:type="dxa" w:w="2016"/>
+            <w:tcW w:type="dxa" w:w="2592"/>
             <w:shd w:fill="F8FAFC"/>
-            <w:tcMar>
-              <w:top w:w="80" w:type="dxa"/>
-              <w:bottom w:w="80" w:type="dxa"/>
-              <w:left w:w="100" w:type="dxa"/>
-              <w:right w:w="100" w:type="dxa"/>
-            </w:tcMar>
           </w:tcPr>
           <w:p>
+            <w:pPr>
+              <w:spacing w:before="80" w:after="80"/>
+            </w:pPr>
             <w:r>
               <w:rPr>
-                <w:b/>
+                <w:rFonts w:ascii="Calibri" w:hAnsi="Calibri"/>
+                <w:b w:val="0"/>
+                <w:i w:val="0"/>
+                <w:color w:val="1E293B"/>
                 <w:sz w:val="19"/>
               </w:rPr>
               <w:t>Screen1 (Login)</w:t>
@@ -264,21 +427,22 @@
         </w:tc>
         <w:tc>
           <w:tcPr>
-            <w:tcW w:type="dxa" w:w="5616"/>
+            <w:tcW w:type="dxa" w:w="5040"/>
             <w:shd w:fill="F8FAFC"/>
-            <w:tcMar>
-              <w:top w:w="80" w:type="dxa"/>
-              <w:bottom w:w="80" w:type="dxa"/>
-              <w:left w:w="100" w:type="dxa"/>
-              <w:right w:w="100" w:type="dxa"/>
-            </w:tcMar>
           </w:tcPr>
           <w:p>
+            <w:pPr>
+              <w:spacing w:before="80" w:after="80"/>
+            </w:pPr>
             <w:r>
               <w:rPr>
+                <w:rFonts w:ascii="Calibri" w:hAnsi="Calibri"/>
+                <w:b w:val="0"/>
+                <w:i w:val="0"/>
+                <w:color w:val="1E293B"/>
                 <w:sz w:val="19"/>
               </w:rPr>
-              <w:t>Punto de entrada seguro con validación de credenciales (usuario/1234), alerta háptica de rechazo ante fallos, persistencia de sesión con TinyDB y diseño Dark Mode con logotipo oficial.</w:t>
+              <w:t>Punto de entrada con usuario y contraseña (usuario / 1234), vibración de aviso ante errores y guardado de sesión con TinyDB.</w:t>
             </w:r>
           </w:p>
         </w:tc>
@@ -288,17 +452,17 @@
           <w:tcPr>
             <w:tcW w:type="dxa" w:w="1728"/>
             <w:shd w:fill="FFFFFF"/>
-            <w:tcMar>
-              <w:top w:w="80" w:type="dxa"/>
-              <w:bottom w:w="80" w:type="dxa"/>
-              <w:left w:w="100" w:type="dxa"/>
-              <w:right w:w="100" w:type="dxa"/>
-            </w:tcMar>
           </w:tcPr>
           <w:p>
+            <w:pPr>
+              <w:spacing w:before="80" w:after="80"/>
+            </w:pPr>
             <w:r>
               <w:rPr>
-                <w:b/>
+                <w:rFonts w:ascii="Calibri" w:hAnsi="Calibri"/>
+                <w:b w:val="0"/>
+                <w:i w:val="0"/>
+                <w:color w:val="1E293B"/>
                 <w:sz w:val="19"/>
               </w:rPr>
               <w:t>Pantalla 2</w:t>
@@ -307,42 +471,43 @@
         </w:tc>
         <w:tc>
           <w:tcPr>
-            <w:tcW w:type="dxa" w:w="2016"/>
+            <w:tcW w:type="dxa" w:w="2592"/>
             <w:shd w:fill="FFFFFF"/>
-            <w:tcMar>
-              <w:top w:w="80" w:type="dxa"/>
-              <w:bottom w:w="80" w:type="dxa"/>
-              <w:left w:w="100" w:type="dxa"/>
-              <w:right w:w="100" w:type="dxa"/>
-            </w:tcMar>
           </w:tcPr>
           <w:p>
+            <w:pPr>
+              <w:spacing w:before="80" w:after="80"/>
+            </w:pPr>
             <w:r>
               <w:rPr>
-                <w:b/>
+                <w:rFonts w:ascii="Calibri" w:hAnsi="Calibri"/>
+                <w:b w:val="0"/>
+                <w:i w:val="0"/>
+                <w:color w:val="1E293B"/>
                 <w:sz w:val="19"/>
               </w:rPr>
-              <w:t>Screen2 (Rutinas)</w:t>
+              <w:t>Screen2 (Ejercicios)</w:t>
             </w:r>
           </w:p>
         </w:tc>
         <w:tc>
           <w:tcPr>
-            <w:tcW w:type="dxa" w:w="5616"/>
+            <w:tcW w:type="dxa" w:w="5040"/>
             <w:shd w:fill="FFFFFF"/>
-            <w:tcMar>
-              <w:top w:w="80" w:type="dxa"/>
-              <w:bottom w:w="80" w:type="dxa"/>
-              <w:left w:w="100" w:type="dxa"/>
-              <w:right w:w="100" w:type="dxa"/>
-            </w:tcMar>
           </w:tcPr>
           <w:p>
+            <w:pPr>
+              <w:spacing w:before="80" w:after="80"/>
+            </w:pPr>
             <w:r>
               <w:rPr>
+                <w:rFonts w:ascii="Calibri" w:hAnsi="Calibri"/>
+                <w:b w:val="0"/>
+                <w:i w:val="0"/>
+                <w:color w:val="1E293B"/>
                 <w:sz w:val="19"/>
               </w:rPr>
-              <w:t>Menú principal donde el deportista selecciona su actividad: Sentadillas Inteligentes (meta de 10 repeticiones) o Podómetro y Trote Activo (meta de 50 pasos). Configura las variables en TinyDB.</w:t>
+              <w:t>Catálogo donde se elige entre Sentadillas y Contador de Pasos, permitiendo ingresar la meta que el usuario desea cumplir.</w:t>
             </w:r>
           </w:p>
         </w:tc>
@@ -352,17 +517,17 @@
           <w:tcPr>
             <w:tcW w:type="dxa" w:w="1728"/>
             <w:shd w:fill="F8FAFC"/>
-            <w:tcMar>
-              <w:top w:w="80" w:type="dxa"/>
-              <w:bottom w:w="80" w:type="dxa"/>
-              <w:left w:w="100" w:type="dxa"/>
-              <w:right w:w="100" w:type="dxa"/>
-            </w:tcMar>
           </w:tcPr>
           <w:p>
+            <w:pPr>
+              <w:spacing w:before="80" w:after="80"/>
+            </w:pPr>
             <w:r>
               <w:rPr>
-                <w:b/>
+                <w:rFonts w:ascii="Calibri" w:hAnsi="Calibri"/>
+                <w:b w:val="0"/>
+                <w:i w:val="0"/>
+                <w:color w:val="1E293B"/>
                 <w:sz w:val="19"/>
               </w:rPr>
               <w:t>Pantalla 3</w:t>
@@ -371,19 +536,19 @@
         </w:tc>
         <w:tc>
           <w:tcPr>
-            <w:tcW w:type="dxa" w:w="2016"/>
+            <w:tcW w:type="dxa" w:w="2592"/>
             <w:shd w:fill="F8FAFC"/>
-            <w:tcMar>
-              <w:top w:w="80" w:type="dxa"/>
-              <w:bottom w:w="80" w:type="dxa"/>
-              <w:left w:w="100" w:type="dxa"/>
-              <w:right w:w="100" w:type="dxa"/>
-            </w:tcMar>
           </w:tcPr>
           <w:p>
+            <w:pPr>
+              <w:spacing w:before="80" w:after="80"/>
+            </w:pPr>
             <w:r>
               <w:rPr>
-                <w:b/>
+                <w:rFonts w:ascii="Calibri" w:hAnsi="Calibri"/>
+                <w:b w:val="0"/>
+                <w:i w:val="0"/>
+                <w:color w:val="1E293B"/>
                 <w:sz w:val="19"/>
               </w:rPr>
               <w:t>Screen3 (En Vivo)</w:t>
@@ -392,21 +557,22 @@
         </w:tc>
         <w:tc>
           <w:tcPr>
-            <w:tcW w:type="dxa" w:w="5616"/>
+            <w:tcW w:type="dxa" w:w="5040"/>
             <w:shd w:fill="F8FAFC"/>
-            <w:tcMar>
-              <w:top w:w="80" w:type="dxa"/>
-              <w:bottom w:w="80" w:type="dxa"/>
-              <w:left w:w="100" w:type="dxa"/>
-              <w:right w:w="100" w:type="dxa"/>
-            </w:tcMar>
           </w:tcPr>
           <w:p>
+            <w:pPr>
+              <w:spacing w:before="80" w:after="80"/>
+            </w:pPr>
             <w:r>
               <w:rPr>
+                <w:rFonts w:ascii="Calibri" w:hAnsi="Calibri"/>
+                <w:b w:val="0"/>
+                <w:i w:val="0"/>
+                <w:color w:val="1E293B"/>
                 <w:sz w:val="19"/>
               </w:rPr>
-              <w:t>Núcleo de monitoreo biomecánico en tiempo real. Integra contador numérico gigante, cronómetro en vivo, telemetría angular y vertical, instrucciones de postura, controles de pausa y finalización.</w:t>
+              <w:t>Pantalla activa con cronómetro, conteo con sensores, botón de Modo Bolsillo para guardar en el pantalón y alarma sonora al terminar.</w:t>
             </w:r>
           </w:p>
         </w:tc>
@@ -416,17 +582,17 @@
           <w:tcPr>
             <w:tcW w:type="dxa" w:w="1728"/>
             <w:shd w:fill="FFFFFF"/>
-            <w:tcMar>
-              <w:top w:w="80" w:type="dxa"/>
-              <w:bottom w:w="80" w:type="dxa"/>
-              <w:left w:w="100" w:type="dxa"/>
-              <w:right w:w="100" w:type="dxa"/>
-            </w:tcMar>
           </w:tcPr>
           <w:p>
+            <w:pPr>
+              <w:spacing w:before="80" w:after="80"/>
+            </w:pPr>
             <w:r>
               <w:rPr>
-                <w:b/>
+                <w:rFonts w:ascii="Calibri" w:hAnsi="Calibri"/>
+                <w:b w:val="0"/>
+                <w:i w:val="0"/>
+                <w:color w:val="1E293B"/>
                 <w:sz w:val="19"/>
               </w:rPr>
               <w:t>Pantalla 4</w:t>
@@ -435,19 +601,19 @@
         </w:tc>
         <w:tc>
           <w:tcPr>
-            <w:tcW w:type="dxa" w:w="2016"/>
+            <w:tcW w:type="dxa" w:w="2592"/>
             <w:shd w:fill="FFFFFF"/>
-            <w:tcMar>
-              <w:top w:w="80" w:type="dxa"/>
-              <w:bottom w:w="80" w:type="dxa"/>
-              <w:left w:w="100" w:type="dxa"/>
-              <w:right w:w="100" w:type="dxa"/>
-            </w:tcMar>
           </w:tcPr>
           <w:p>
+            <w:pPr>
+              <w:spacing w:before="80" w:after="80"/>
+            </w:pPr>
             <w:r>
               <w:rPr>
-                <w:b/>
+                <w:rFonts w:ascii="Calibri" w:hAnsi="Calibri"/>
+                <w:b w:val="0"/>
+                <w:i w:val="0"/>
+                <w:color w:val="1E293B"/>
                 <w:sz w:val="19"/>
               </w:rPr>
               <w:t>Screen4 (Resumen)</w:t>
@@ -456,21 +622,22 @@
         </w:tc>
         <w:tc>
           <w:tcPr>
-            <w:tcW w:type="dxa" w:w="5616"/>
+            <w:tcW w:type="dxa" w:w="5040"/>
             <w:shd w:fill="FFFFFF"/>
-            <w:tcMar>
-              <w:top w:w="80" w:type="dxa"/>
-              <w:bottom w:w="80" w:type="dxa"/>
-              <w:left w:w="100" w:type="dxa"/>
-              <w:right w:w="100" w:type="dxa"/>
-            </w:tcMar>
           </w:tcPr>
           <w:p>
+            <w:pPr>
+              <w:spacing w:before="80" w:after="80"/>
+            </w:pPr>
             <w:r>
               <w:rPr>
+                <w:rFonts w:ascii="Calibri" w:hAnsi="Calibri"/>
+                <w:b w:val="0"/>
+                <w:i w:val="0"/>
+                <w:color w:val="1E293B"/>
                 <w:sz w:val="19"/>
               </w:rPr>
-              <w:t>Panel de resultados post-ejercicio. Recupera desde TinyDB el volumen de repeticiones o pasos logrados, tiempo total invertido y estimaciones, permitiendo reiniciar o salir de forma ordenada.</w:t>
+              <w:t>Panel de resultados con repeticiones totales, tiempo invertido y calorías estimadas, permitiendo iniciar otro entrenamiento o salir.</w:t>
             </w:r>
           </w:p>
         </w:tc>
@@ -478,18 +645,13 @@
     </w:tbl>
     <w:p>
       <w:pPr>
-        <w:spacing w:after="160"/>
-      </w:pPr>
-    </w:p>
-    <w:p>
-      <w:pPr>
-        <w:spacing w:before="120" w:after="80"/>
+        <w:spacing w:before="280" w:after="80"/>
         <w:jc w:val="center"/>
       </w:pPr>
       <w:r>
         <w:drawing>
           <wp:inline xmlns:a="http://schemas.openxmlformats.org/drawingml/2006/main" xmlns:pic="http://schemas.openxmlformats.org/drawingml/2006/picture">
-            <wp:extent cx="2011680" cy="3909060"/>
+            <wp:extent cx="2377440" cy="4619798"/>
             <wp:docPr id="1" name="Picture 1"/>
             <wp:cNvGraphicFramePr>
               <a:graphicFrameLocks noChangeAspect="1"/>
@@ -510,7 +672,7 @@
                   <pic:spPr>
                     <a:xfrm>
                       <a:off x="0" y="0"/>
-                      <a:ext cx="2011680" cy="3909060"/>
+                      <a:ext cx="2377440" cy="4619798"/>
                     </a:xfrm>
                     <a:prstGeom prst="rect"/>
                   </pic:spPr>
@@ -523,269 +685,514 @@
     </w:p>
     <w:p>
       <w:pPr>
-        <w:spacing w:after="200"/>
+        <w:spacing w:after="240"/>
         <w:jc w:val="center"/>
       </w:pPr>
       <w:r>
         <w:rPr>
+          <w:rFonts w:ascii="Calibri" w:hAnsi="Calibri"/>
+          <w:b w:val="0"/>
           <w:i/>
-          <w:color w:val="475569"/>
-          <w:sz w:val="18"/>
+          <w:color w:val="64748B"/>
+          <w:sz w:val="19"/>
         </w:rPr>
-        <w:t>Figura 1: Interfaz de usuario de FitMotion ejecutada en dispositivo móvil</w:t>
+        <w:t>Figura 1: Interfaz móvil de FitMotion ejecutada en teléfono Android</w:t>
       </w:r>
     </w:p>
     <w:p>
       <w:pPr>
         <w:keepNext/>
-        <w:spacing w:before="240" w:after="80"/>
+        <w:spacing w:before="320" w:after="120"/>
       </w:pPr>
       <w:r>
         <w:rPr>
           <w:rFonts w:ascii="Calibri" w:hAnsi="Calibri"/>
           <w:b/>
+          <w:i w:val="0"/>
           <w:color w:val="0F172A"/>
-          <w:sz w:val="30"/>
+          <w:sz w:val="28"/>
         </w:rPr>
-        <w:t>5. Integración de Recursos de Hardware</w:t>
-      </w:r>
-    </w:p>
-    <w:p>
-      <w:r>
-        <w:t>FitMotion incorpora hardware nativo del teléfono inteligente para garantizar que la recolección de datos sea completamente funcional dentro de la solución:</w:t>
-      </w:r>
-    </w:p>
-    <w:p>
-      <w:r>
-        <w:rPr>
-          <w:b/>
-          <w:color w:val="0F172A"/>
-        </w:rPr>
-        <w:t>A. Sensor de Orientación (OrientationSensor1)</w:t>
-        <w:br/>
-      </w:r>
-      <w:r>
-        <w:t>• Parámetro utilizado: Grados de inclinación angular longitudinal (Pitch).</w:t>
-        <w:br/>
-        <w:t>• Función en el sistema: Al colocar el teléfono en el bolsillo lateral del pantalón o sujeto al muslo, el sensor registra directamente la inclinación del fémur. Durante la flexión de una sentadilla, el ángulo respecto a la vertical cambia de manera proporcional al descenso.</w:t>
-        <w:br/>
-        <w:t>• Criterio cinemático: Se estableció que para considerar una flexión adecuada, la inclinación debe alcanzar o superar los 45° de Pitch. La repetición se valida únicamente cuando el usuario retorna a la posición erguida (inclinación inferior a 25°). Este umbral previene conteos fraudulentos causados por balanceos de tronco.</w:t>
-      </w:r>
-    </w:p>
-    <w:p>
-      <w:r>
-        <w:rPr>
-          <w:b/>
-          <w:color w:val="0F172A"/>
-        </w:rPr>
-        <w:t>B. Acelerómetro (AccelerometerSensor1)</w:t>
-        <w:br/>
-      </w:r>
-      <w:r>
-        <w:t>• Parámetro utilizado: Aceleración lineal en el eje vertical (YAccel, medido en m/s²).</w:t>
-        <w:br/>
-        <w:t>• Función en el sistema: En la rutina de caminata y trote, el sensor monitorea las fuerzas reactivas del suelo que se transmiten al cuerpo en cada zancada.</w:t>
-        <w:br/>
-        <w:t>• Criterio cinemático: Al registrarse un impacto que exceda los 12 m/s² en el eje vertical, el sistema reconoce la existencia de un paso y lo procesa a través del filtro de estabilidad.</w:t>
-      </w:r>
-    </w:p>
-    <w:p>
-      <w:r>
-        <w:rPr>
-          <w:b/>
-          <w:color w:val="0096D6"/>
-        </w:rPr>
-        <w:t>C. Actuadores de Retroalimentación Complementarios</w:t>
-        <w:br/>
-      </w:r>
-      <w:r>
-        <w:t>• Motor Háptico (Sound1.Vibrate): Proporciona retroalimentación táctil diferenciada (40 ms para aviso de profundidad alcanzada, 100 ms para repetición completada, 30 ms por paso y 250 ms por credenciales erróneas).</w:t>
-        <w:br/>
-        <w:t>• Síntesis de Voz (TextToSpeech1): Verbaliza el inicio del ejercicio y canta en voz alta el número de repetición completada, posibilitando el entrenamiento manos libres sin necesidad de mirar la pantalla.</w:t>
+        <w:t>5. Sensores de Hardware Utilizados</w:t>
       </w:r>
     </w:p>
     <w:p>
       <w:pPr>
-        <w:spacing w:after="160"/>
+        <w:spacing w:before="0" w:after="120" w:line="276" w:lineRule="auto"/>
       </w:pPr>
+      <w:r>
+        <w:rPr>
+          <w:rFonts w:ascii="Calibri" w:hAnsi="Calibri"/>
+          <w:b w:val="0"/>
+          <w:i w:val="0"/>
+          <w:color w:val="1E293B"/>
+          <w:sz w:val="22"/>
+        </w:rPr>
+        <w:t>Cumpliendo con la rúbrica oficial de la evaluación, FitMotion utiliza dos sensores físicos nativos del teléfono de forma 100% práctica y funcional dentro del flujo de la app:</w:t>
+      </w:r>
     </w:p>
     <w:p>
       <w:pPr>
-        <w:keepNext/>
-        <w:spacing w:before="240" w:after="80"/>
+        <w:pStyle w:val="ListBullet"/>
+        <w:spacing w:before="0" w:after="80" w:line="276" w:lineRule="auto"/>
       </w:pPr>
       <w:r>
         <w:rPr>
           <w:rFonts w:ascii="Calibri" w:hAnsi="Calibri"/>
           <w:b/>
+          <w:i w:val="0"/>
           <w:color w:val="0F172A"/>
-          <w:sz w:val="30"/>
+          <w:sz w:val="22"/>
         </w:rPr>
-        <w:t>6. Lógica de Programación y Arquitectura de Bloques</w:t>
+        <w:t xml:space="preserve">Sensor de Orientación / Inclinación (OrientationSensor): </w:t>
       </w:r>
-    </w:p>
-    <w:p>
       <w:r>
         <w:rPr>
-          <w:b/>
-          <w:color w:val="0F172A"/>
+          <w:rFonts w:ascii="Calibri" w:hAnsi="Calibri"/>
+          <w:b w:val="0"/>
+          <w:i w:val="0"/>
+          <w:color w:val="1E293B"/>
+          <w:sz w:val="22"/>
         </w:rPr>
-        <w:t>• Máquina de Estados Finitos para Sentadillas:</w:t>
-      </w:r>
-      <w:r>
-        <w:t xml:space="preserve"> Para evitar conteos duplicados en posición estática, se implementó una máquina de estados con la variable global 'fase'. El flujo inicia en 'ARRIBA'. Al descender a Pitch &gt;= 45°, conmuta a 'ABAJO' y emite aviso háptico. Solo cuando el ángulo retorna a &lt;= 25°, vuelve a 'ARRIBA', suma la repetición y emite la confirmación vocal y táctil.</w:t>
-      </w:r>
-    </w:p>
-    <w:p>
-      <w:r>
-        <w:rPr>
-          <w:b/>
-          <w:color w:val="0F172A"/>
-        </w:rPr>
-        <w:t>• Filtro Temporal de Rebote (Debounce) en Podómetro:</w:t>
-      </w:r>
-      <w:r>
-        <w:t xml:space="preserve"> Durante el trote, el choque del pie suele producir oscilaciones secundarias en el acelerómetro. Se implementó una variable 'cooldown' que se activa tras un impacto y decrementa en cada ciclo de reloj, bloqueando lecturas secundarias hasta estabilizarse.</w:t>
-      </w:r>
-    </w:p>
-    <w:p>
-      <w:r>
-        <w:rPr>
-          <w:b/>
-          <w:color w:val="0F172A"/>
-        </w:rPr>
-        <w:t>• Persistencia Local con TinyDB:</w:t>
-      </w:r>
-      <w:r>
-        <w:t xml:space="preserve"> La información transita entre pantallas de forma desacoplada mediante TinyDB ('UsuarioActivo', 'Modo', 'Meta', 'RepsFinales' y 'TiempoFinal'), garantizando trazabilidad y preservando los datos de sesión.</w:t>
-      </w:r>
-    </w:p>
-    <w:p>
-      <w:r>
-        <w:rPr>
-          <w:b/>
-          <w:color w:val="0F172A"/>
-        </w:rPr>
-        <w:t>• Doble Reloj Asíncrono:</w:t>
-      </w:r>
-      <w:r>
-        <w:t xml:space="preserve"> Se configuraron dos instancias de Clock con responsabilidades separadas: ClockCrono (1000 ms) para la base de tiempo del cronómetro, y ClockSensores (250 ms / 4 Hz) para el muestreo ágil de telemetría inercial.</w:t>
-      </w:r>
-    </w:p>
-    <w:p>
-      <w:r>
-        <w:rPr>
-          <w:b/>
-          <w:color w:val="0F172A"/>
-        </w:rPr>
-        <w:t>• Control de Ciclo de Vida (BackPressed):</w:t>
-      </w:r>
-      <w:r>
-        <w:t xml:space="preserve"> Cada pantalla programa explícitamente el evento BackPressed, regresando ordenadamente a la pantalla anterior o cerrando la app sin depender del cierre forzado del sistema operativo.</w:t>
+        <w:t>Mide los grados de inclinación longitudinal (Pitch). Al colocarse el teléfono en el muslo o bolsillo delantero, detecta cuándo la sentadilla baja más de 45° y cuándo la persona se levanta (&lt; 25°) para validar una repetición real.</w:t>
       </w:r>
     </w:p>
     <w:p>
       <w:pPr>
-        <w:spacing w:after="160"/>
-      </w:pPr>
-    </w:p>
-    <w:p>
-      <w:pPr>
-        <w:keepNext/>
-        <w:spacing w:before="240" w:after="80"/>
+        <w:pStyle w:val="ListBullet"/>
+        <w:spacing w:before="0" w:after="80" w:line="276" w:lineRule="auto"/>
       </w:pPr>
       <w:r>
         <w:rPr>
           <w:rFonts w:ascii="Calibri" w:hAnsi="Calibri"/>
           <w:b/>
+          <w:i w:val="0"/>
           <w:color w:val="0F172A"/>
-          <w:sz w:val="30"/>
+          <w:sz w:val="22"/>
+        </w:rPr>
+        <w:t xml:space="preserve">Sensor de Movimiento / Acelerómetro (AccelerometerSensor): </w:t>
+      </w:r>
+      <w:r>
+        <w:rPr>
+          <w:rFonts w:ascii="Calibri" w:hAnsi="Calibri"/>
+          <w:b w:val="0"/>
+          <w:i w:val="0"/>
+          <w:color w:val="1E293B"/>
+          <w:sz w:val="22"/>
+        </w:rPr>
+        <w:t>Registra la fuerza vertical generada en cada paso al caminar o trotar. Filtra pequeños rebotes para asegurar que cada pisada sume exactamente un paso.</w:t>
+      </w:r>
+    </w:p>
+    <w:p>
+      <w:pPr>
+        <w:pStyle w:val="ListBullet"/>
+        <w:spacing w:before="0" w:after="80" w:line="276" w:lineRule="auto"/>
+      </w:pPr>
+      <w:r>
+        <w:rPr>
+          <w:rFonts w:ascii="Calibri" w:hAnsi="Calibri"/>
+          <w:b/>
+          <w:i w:val="0"/>
+          <w:color w:val="0F172A"/>
+          <w:sz w:val="22"/>
+        </w:rPr>
+        <w:t xml:space="preserve">Sonido de Alarma (Sound): </w:t>
+      </w:r>
+      <w:r>
+        <w:rPr>
+          <w:rFonts w:ascii="Calibri" w:hAnsi="Calibri"/>
+          <w:b w:val="0"/>
+          <w:i w:val="0"/>
+          <w:color w:val="1E293B"/>
+          <w:sz w:val="22"/>
+        </w:rPr>
+        <w:t>Reproduce el archivo de audio alarma.wav para alertar con un tono fuerte y claro que el objetivo fue completado.</w:t>
+      </w:r>
+    </w:p>
+    <w:p>
+      <w:pPr>
+        <w:pStyle w:val="ListBullet"/>
+        <w:spacing w:before="0" w:after="80" w:line="276" w:lineRule="auto"/>
+      </w:pPr>
+      <w:r>
+        <w:rPr>
+          <w:rFonts w:ascii="Calibri" w:hAnsi="Calibri"/>
+          <w:b/>
+          <w:i w:val="0"/>
+          <w:color w:val="0F172A"/>
+          <w:sz w:val="22"/>
+        </w:rPr>
+        <w:t xml:space="preserve">Vibración del Teléfono: </w:t>
+      </w:r>
+      <w:r>
+        <w:rPr>
+          <w:rFonts w:ascii="Calibri" w:hAnsi="Calibri"/>
+          <w:b w:val="0"/>
+          <w:i w:val="0"/>
+          <w:color w:val="1E293B"/>
+          <w:sz w:val="22"/>
+        </w:rPr>
+        <w:t>Avisa al llegar a la profundidad correcta (40 ms), al sumar una repetición (100 ms) y emite un pulso largo (1.500 ms) cuando la meta se cumple.</w:t>
+      </w:r>
+    </w:p>
+    <w:p>
+      <w:pPr>
+        <w:pStyle w:val="ListBullet"/>
+        <w:spacing w:before="0" w:after="80" w:line="276" w:lineRule="auto"/>
+      </w:pPr>
+      <w:r>
+        <w:rPr>
+          <w:rFonts w:ascii="Calibri" w:hAnsi="Calibri"/>
+          <w:b/>
+          <w:i w:val="0"/>
+          <w:color w:val="0F172A"/>
+          <w:sz w:val="22"/>
+        </w:rPr>
+        <w:t xml:space="preserve">Voz del Dispositivo (TextToSpeech): </w:t>
+      </w:r>
+      <w:r>
+        <w:rPr>
+          <w:rFonts w:ascii="Calibri" w:hAnsi="Calibri"/>
+          <w:b w:val="0"/>
+          <w:i w:val="0"/>
+          <w:color w:val="1E293B"/>
+          <w:sz w:val="22"/>
+        </w:rPr>
+        <w:t>Narra el inicio del ejercicio, cuenta el número de repeticiones y felicita al usuario al terminar.</w:t>
+      </w:r>
+    </w:p>
+    <w:p>
+      <w:pPr>
+        <w:keepNext/>
+        <w:spacing w:before="320" w:after="120"/>
+      </w:pPr>
+      <w:r>
+        <w:rPr>
+          <w:rFonts w:ascii="Calibri" w:hAnsi="Calibri"/>
+          <w:b/>
+          <w:i w:val="0"/>
+          <w:color w:val="0F172A"/>
+          <w:sz w:val="28"/>
+        </w:rPr>
+        <w:t>6. Funcionamiento con el Celular en el Bolsillo (Modo Bolsillo)</w:t>
+      </w:r>
+    </w:p>
+    <w:p>
+      <w:pPr>
+        <w:spacing w:before="0" w:after="120" w:line="276" w:lineRule="auto"/>
+      </w:pPr>
+      <w:r>
+        <w:rPr>
+          <w:rFonts w:ascii="Calibri" w:hAnsi="Calibri"/>
+          <w:b w:val="0"/>
+          <w:i w:val="0"/>
+          <w:color w:val="1E293B"/>
+          <w:sz w:val="22"/>
+        </w:rPr>
+        <w:t>En Android, cuando se apaga la pantalla con el botón físico de encendido, el sistema operativo congela los sensores de las aplicaciones estándar para ahorrar batería. Para resolver esta limitación de manera elegante y 100% compatible con MIT AI2 Companion:</w:t>
+      </w:r>
+    </w:p>
+    <w:p>
+      <w:pPr>
+        <w:spacing w:before="0" w:after="120" w:line="276" w:lineRule="auto"/>
+      </w:pPr>
+      <w:r>
+        <w:rPr>
+          <w:rFonts w:ascii="Calibri" w:hAnsi="Calibri"/>
+          <w:b w:val="0"/>
+          <w:i w:val="0"/>
+          <w:color w:val="1E293B"/>
+          <w:sz w:val="22"/>
+        </w:rPr>
+        <w:t>1. FitMotion incorpora el botón directo '🔒 MODO BOLSILLO'. Al presionarlo, la pantalla se coloca en fondo negro absoluto (modo de ahorro de energía OLED) y se bloquean los botones para evitar toques involuntarios causados por el roce de la ropa.</w:t>
+      </w:r>
+    </w:p>
+    <w:p>
+      <w:pPr>
+        <w:spacing w:before="0" w:after="120" w:line="276" w:lineRule="auto"/>
+      </w:pPr>
+      <w:r>
+        <w:rPr>
+          <w:rFonts w:ascii="Calibri" w:hAnsi="Calibri"/>
+          <w:b w:val="0"/>
+          <w:i w:val="0"/>
+          <w:color w:val="1E293B"/>
+          <w:sz w:val="22"/>
+        </w:rPr>
+        <w:t>2. Tanto el acelerómetro como el sensor de inclinación continúan midiendo en tiempo real, y los relojes internos de la app siguen corriendo con la propiedad TimerAlwaysFires activada.</w:t>
+      </w:r>
+    </w:p>
+    <w:p>
+      <w:pPr>
+        <w:spacing w:before="0" w:after="120" w:line="276" w:lineRule="auto"/>
+      </w:pPr>
+      <w:r>
+        <w:rPr>
+          <w:rFonts w:ascii="Calibri" w:hAnsi="Calibri"/>
+          <w:b w:val="0"/>
+          <w:i w:val="0"/>
+          <w:color w:val="1E293B"/>
+          <w:sz w:val="22"/>
+        </w:rPr>
+        <w:t>3. La persona puede meter el teléfono a su bolsillo con total confianza. El teléfono cuenta cada sentadilla o paso, canta el número por voz y, al llegar a la meta (ej. 15 sentadillas), la alarma suena fuerte y claro directamente desde el bolsillo.</w:t>
+      </w:r>
+    </w:p>
+    <w:p>
+      <w:pPr>
+        <w:spacing w:before="0" w:after="120" w:line="276" w:lineRule="auto"/>
+      </w:pPr>
+      <w:r>
+        <w:rPr>
+          <w:rFonts w:ascii="Calibri" w:hAnsi="Calibri"/>
+          <w:b w:val="0"/>
+          <w:i w:val="0"/>
+          <w:color w:val="1E293B"/>
+          <w:sz w:val="22"/>
+        </w:rPr>
+        <w:t>4. Al terminar, el usuario saca el teléfono, pulsa '🔓 DESBLOQUEAR PANTALLA' y puede revisar el resumen de su entrenamiento.</w:t>
+      </w:r>
+    </w:p>
+    <w:p>
+      <w:pPr>
+        <w:keepNext/>
+        <w:spacing w:before="320" w:after="120"/>
+      </w:pPr>
+      <w:r>
+        <w:rPr>
+          <w:rFonts w:ascii="Calibri" w:hAnsi="Calibri"/>
+          <w:b/>
+          <w:i w:val="0"/>
+          <w:color w:val="0F172A"/>
+          <w:sz w:val="28"/>
         </w:rPr>
         <w:t>7. Guía de Ejecución y Demostración en MIT AI2 Companion</w:t>
       </w:r>
     </w:p>
     <w:p>
+      <w:pPr>
+        <w:spacing w:before="0" w:after="120" w:line="276" w:lineRule="auto"/>
+      </w:pPr>
       <w:r>
         <w:rPr>
-          <w:b/>
-          <w:color w:val="0F172A"/>
+          <w:rFonts w:ascii="Calibri" w:hAnsi="Calibri"/>
+          <w:b w:val="0"/>
+          <w:i w:val="0"/>
+          <w:color w:val="1E293B"/>
+          <w:sz w:val="22"/>
         </w:rPr>
-        <w:t>• Carga del Proyecto:</w:t>
-      </w:r>
-      <w:r>
-        <w:t xml:space="preserve"> Importar el archivo FitMotion.aia en la plataforma web de MIT App Inventor. En el menú superior seleccionar Connect -&gt; AI Companion.</w:t>
+        <w:t>Para probar la aplicación en un dispositivo Android real:</w:t>
       </w:r>
     </w:p>
     <w:p>
+      <w:pPr>
+        <w:pStyle w:val="ListBullet"/>
+        <w:spacing w:before="0" w:after="80" w:line="276" w:lineRule="auto"/>
+      </w:pPr>
       <w:r>
         <w:rPr>
+          <w:rFonts w:ascii="Calibri" w:hAnsi="Calibri"/>
           <w:b/>
+          <w:i w:val="0"/>
           <w:color w:val="0F172A"/>
+          <w:sz w:val="22"/>
         </w:rPr>
-        <w:t>• Enlace con el Dispositivo:</w:t>
+        <w:t xml:space="preserve">1. Cargar el Proyecto: </w:t>
       </w:r>
       <w:r>
-        <w:t xml:space="preserve"> Abrir la aplicación MIT AI2 Companion en el teléfono Android e ingresar el código alfanumérico o escanear el código QR en pantalla.</w:t>
+        <w:rPr>
+          <w:rFonts w:ascii="Calibri" w:hAnsi="Calibri"/>
+          <w:b w:val="0"/>
+          <w:i w:val="0"/>
+          <w:color w:val="1E293B"/>
+          <w:sz w:val="22"/>
+        </w:rPr>
+        <w:t>Ingresar a ai2.appinventor.mit.edu, seleccionar Projects -&gt; Import project (.aia) from my computer y subir FitMotion.aia.</w:t>
       </w:r>
     </w:p>
     <w:p>
+      <w:pPr>
+        <w:pStyle w:val="ListBullet"/>
+        <w:spacing w:before="0" w:after="80" w:line="276" w:lineRule="auto"/>
+      </w:pPr>
       <w:r>
         <w:rPr>
+          <w:rFonts w:ascii="Calibri" w:hAnsi="Calibri"/>
           <w:b/>
+          <w:i w:val="0"/>
           <w:color w:val="0F172A"/>
+          <w:sz w:val="22"/>
         </w:rPr>
-        <w:t>• Prueba de Ingreso (Screen1):</w:t>
+        <w:t xml:space="preserve">2. Conectar el Móvil: </w:t>
       </w:r>
       <w:r>
-        <w:t xml:space="preserve"> Ingresar credenciales (usuario / 1234) y observar el control de acceso con vibración táctil.</w:t>
+        <w:rPr>
+          <w:rFonts w:ascii="Calibri" w:hAnsi="Calibri"/>
+          <w:b w:val="0"/>
+          <w:i w:val="0"/>
+          <w:color w:val="1E293B"/>
+          <w:sz w:val="22"/>
+        </w:rPr>
+        <w:t>En el menú superior seleccionar Connect -&gt; AI Companion y escanear el código QR con la app MIT AI2 Companion del teléfono.</w:t>
       </w:r>
     </w:p>
     <w:p>
+      <w:pPr>
+        <w:pStyle w:val="ListBullet"/>
+        <w:spacing w:before="0" w:after="80" w:line="276" w:lineRule="auto"/>
+      </w:pPr>
       <w:r>
         <w:rPr>
+          <w:rFonts w:ascii="Calibri" w:hAnsi="Calibri"/>
           <w:b/>
+          <w:i w:val="0"/>
           <w:color w:val="0F172A"/>
+          <w:sz w:val="22"/>
         </w:rPr>
-        <w:t>• Selección y Configuración (Screen2):</w:t>
+        <w:t xml:space="preserve">3. Inicio de Sesión: </w:t>
       </w:r>
       <w:r>
-        <w:t xml:space="preserve"> En el catálogo de actividades, seleccionar Sentadillas Inteligentes.</w:t>
+        <w:rPr>
+          <w:rFonts w:ascii="Calibri" w:hAnsi="Calibri"/>
+          <w:b w:val="0"/>
+          <w:i w:val="0"/>
+          <w:color w:val="1E293B"/>
+          <w:sz w:val="22"/>
+        </w:rPr>
+        <w:t>Ingresar usuario y clave (usuario / 1234) para acceder al menú de ejercicios.</w:t>
       </w:r>
     </w:p>
     <w:p>
+      <w:pPr>
+        <w:pStyle w:val="ListBullet"/>
+        <w:spacing w:before="0" w:after="80" w:line="276" w:lineRule="auto"/>
+      </w:pPr>
       <w:r>
         <w:rPr>
+          <w:rFonts w:ascii="Calibri" w:hAnsi="Calibri"/>
           <w:b/>
+          <w:i w:val="0"/>
           <w:color w:val="0F172A"/>
+          <w:sz w:val="22"/>
         </w:rPr>
-        <w:t>• Evaluación Biomecánica (Screen3):</w:t>
+        <w:t xml:space="preserve">4. Configurar Objetivo: </w:t>
       </w:r>
       <w:r>
-        <w:t xml:space="preserve"> Con el teléfono orientado verticalmente simulando el muslo, flexionar hacia adelante superando los 45°. Se observará el cambio de estado a '¡BUENA PROFUNDIDAD!' y la vibración corta. Al erguirse por debajo de 25°, el contador sumará la unidad y el teléfono cantará el número por voz.</w:t>
+        <w:rPr>
+          <w:rFonts w:ascii="Calibri" w:hAnsi="Calibri"/>
+          <w:b w:val="0"/>
+          <w:i w:val="0"/>
+          <w:color w:val="1E293B"/>
+          <w:sz w:val="22"/>
+        </w:rPr>
+        <w:t>En la pantalla de selección, escribir la meta deseada (por ejemplo, 5 o 15 sentadillas).</w:t>
       </w:r>
     </w:p>
     <w:p>
+      <w:pPr>
+        <w:pStyle w:val="ListBullet"/>
+        <w:spacing w:before="0" w:after="80" w:line="276" w:lineRule="auto"/>
+      </w:pPr>
       <w:r>
         <w:rPr>
+          <w:rFonts w:ascii="Calibri" w:hAnsi="Calibri"/>
           <w:b/>
+          <w:i w:val="0"/>
           <w:color w:val="0F172A"/>
+          <w:sz w:val="22"/>
         </w:rPr>
-        <w:t>• Control Operativo:</w:t>
+        <w:t xml:space="preserve">5. Probar el Modo Bolsillo: </w:t>
       </w:r>
       <w:r>
-        <w:t xml:space="preserve"> Verificar la alternancia del botón Pausar / Reanudar.</w:t>
+        <w:rPr>
+          <w:rFonts w:ascii="Calibri" w:hAnsi="Calibri"/>
+          <w:b w:val="0"/>
+          <w:i w:val="0"/>
+          <w:color w:val="1E293B"/>
+          <w:sz w:val="22"/>
+        </w:rPr>
+        <w:t>Presionar 'MODO BOLSILLO', inclinar el teléfono hacia adelante simulando la flexión de rodilla (&gt; 45°) y levantarlo. Sentirás la vibración y escucharás la voz.</w:t>
       </w:r>
     </w:p>
     <w:p>
+      <w:pPr>
+        <w:pStyle w:val="ListBullet"/>
+        <w:spacing w:before="0" w:after="80" w:line="276" w:lineRule="auto"/>
+      </w:pPr>
       <w:r>
         <w:rPr>
+          <w:rFonts w:ascii="Calibri" w:hAnsi="Calibri"/>
           <w:b/>
+          <w:i w:val="0"/>
           <w:color w:val="0F172A"/>
+          <w:sz w:val="22"/>
         </w:rPr>
-        <w:t>• Resumen y Cierre (Screen4):</w:t>
+        <w:t xml:space="preserve">6. Verificar la Alarma: </w:t>
       </w:r>
       <w:r>
-        <w:t xml:space="preserve"> Presionar Finalizar para constatar la recepción de métricas consolidadas desde TinyDB en la pantalla final de resultados.</w:t>
+        <w:rPr>
+          <w:rFonts w:ascii="Calibri" w:hAnsi="Calibri"/>
+          <w:b w:val="0"/>
+          <w:i w:val="0"/>
+          <w:color w:val="1E293B"/>
+          <w:sz w:val="22"/>
+        </w:rPr>
+        <w:t>Al completar la meta configurada, comprobarás cómo suena la alarma sonora, vibra de forma prolongada y la pantalla celebra el objetivo completado.</w:t>
+      </w:r>
+    </w:p>
+    <w:p>
+      <w:pPr>
+        <w:pStyle w:val="ListBullet"/>
+        <w:spacing w:before="0" w:after="80" w:line="276" w:lineRule="auto"/>
+      </w:pPr>
+      <w:r>
+        <w:rPr>
+          <w:rFonts w:ascii="Calibri" w:hAnsi="Calibri"/>
+          <w:b/>
+          <w:i w:val="0"/>
+          <w:color w:val="0F172A"/>
+          <w:sz w:val="22"/>
+        </w:rPr>
+        <w:t xml:space="preserve">7. Ver Resumen: </w:t>
+      </w:r>
+      <w:r>
+        <w:rPr>
+          <w:rFonts w:ascii="Calibri" w:hAnsi="Calibri"/>
+          <w:b w:val="0"/>
+          <w:i w:val="0"/>
+          <w:color w:val="1E293B"/>
+          <w:sz w:val="22"/>
+        </w:rPr>
+        <w:t>Desbloquear y presionar Finalizar para ver la pantalla de resultados con el tiempo y calorías quemadas.</w:t>
+      </w:r>
+    </w:p>
+    <w:p>
+      <w:pPr>
+        <w:keepNext/>
+        <w:spacing w:before="320" w:after="120"/>
+      </w:pPr>
+      <w:r>
+        <w:rPr>
+          <w:rFonts w:ascii="Calibri" w:hAnsi="Calibri"/>
+          <w:b/>
+          <w:i w:val="0"/>
+          <w:color w:val="0F172A"/>
+          <w:sz w:val="28"/>
+        </w:rPr>
+        <w:t>8. Conclusión</w:t>
+      </w:r>
+    </w:p>
+    <w:p>
+      <w:pPr>
+        <w:spacing w:before="0" w:after="120" w:line="276" w:lineRule="auto"/>
+      </w:pPr>
+      <w:r>
+        <w:rPr>
+          <w:rFonts w:ascii="Calibri" w:hAnsi="Calibri"/>
+          <w:b w:val="0"/>
+          <w:i w:val="0"/>
+          <w:color w:val="1E293B"/>
+          <w:sz w:val="22"/>
+        </w:rPr>
+        <w:t>FitMotion demuestra cómo los sensores internos de un teléfono inteligente pueden aprovecharse para crear una herramienta útil, accesible y motivadora para la salud de las personas. La incorporación de metas personalizadas, alarmas sonoras y el Modo Bolsillo resuelve las principales incomodidades del entrenamiento en solitario, permitiendo una experiencia cómoda, automática y con manos libres.</w:t>
       </w:r>
     </w:p>
     <w:sectPr>

</xml_diff>